<commit_message>
Interpretation of PathPlanning calculation fixed
</commit_message>
<xml_diff>
--- a/reports/Report4.docx
+++ b/reports/Report4.docx
@@ -1,182 +1,164 @@
 
 <file path=word/document.xml><?xml version="1.0" encoding="utf-8"?>
-<w:document xmlns:wpc="http://schemas.microsoft.com/office/word/2010/wordprocessingCanvas" xmlns:cx="http://schemas.microsoft.com/office/drawing/2014/chartex" xmlns:cx1="http://schemas.microsoft.com/office/drawing/2015/9/8/chartex" xmlns:cx2="http://schemas.microsoft.com/office/drawing/2015/10/21/chartex" xmlns:cx3="http://schemas.microsoft.com/office/drawing/2016/5/9/chartex" xmlns:cx4="http://schemas.microsoft.com/office/drawing/2016/5/10/chartex" xmlns:cx5="http://schemas.microsoft.com/office/drawing/2016/5/11/chartex" xmlns:cx6="http://schemas.microsoft.com/office/drawing/2016/5/12/chartex" xmlns:cx7="http://schemas.microsoft.com/office/drawing/2016/5/13/chartex" xmlns:cx8="http://schemas.microsoft.com/office/drawing/2016/5/14/chartex" xmlns:mc="http://schemas.openxmlformats.org/markup-compatibility/2006" xmlns:aink="http://schemas.microsoft.com/office/drawing/2016/ink" xmlns:am3d="http://schemas.microsoft.com/office/drawing/2017/model3d" xmlns:o="urn:schemas-microsoft-com:office:office" xmlns:r="http://schemas.openxmlformats.org/officeDocument/2006/relationships" xmlns:m="http://schemas.openxmlformats.org/officeDocument/2006/math" xmlns:v="urn:schemas-microsoft-com:vml" xmlns:wp14="http://schemas.microsoft.com/office/word/2010/wordprocessingDrawing" xmlns:wp="http://schemas.openxmlformats.org/drawingml/2006/wordprocessingDrawing" xmlns:w10="urn:schemas-microsoft-com:office:word" xmlns:w="http://schemas.openxmlformats.org/wordprocessingml/2006/main" xmlns:w14="http://schemas.microsoft.com/office/word/2010/wordml" xmlns:w15="http://schemas.microsoft.com/office/word/2012/wordml" xmlns:w16cex="http://schemas.microsoft.com/office/word/2018/wordml/cex" xmlns:w16cid="http://schemas.microsoft.com/office/word/2016/wordml/cid" xmlns:w16="http://schemas.microsoft.com/office/word/2018/wordml" xmlns:w16sdtdh="http://schemas.microsoft.com/office/word/2020/wordml/sdtdatahash" xmlns:w16se="http://schemas.microsoft.com/office/word/2015/wordml/symex" xmlns:wpg="http://schemas.microsoft.com/office/word/2010/wordprocessingGroup" xmlns:wpi="http://schemas.microsoft.com/office/word/2010/wordprocessingInk" xmlns:wne="http://schemas.microsoft.com/office/word/2006/wordml" xmlns:wps="http://schemas.microsoft.com/office/word/2010/wordprocessingShape" mc:Ignorable="w14 w15 w16se w16cid w16 w16cex w16sdtdh wp14">
+<w:document xmlns:wpc="http://schemas.microsoft.com/office/word/2010/wordprocessingCanvas" xmlns:cx="http://schemas.microsoft.com/office/drawing/2014/chartex" xmlns:cx1="http://schemas.microsoft.com/office/drawing/2015/9/8/chartex" xmlns:cx2="http://schemas.microsoft.com/office/drawing/2015/10/21/chartex" xmlns:cx3="http://schemas.microsoft.com/office/drawing/2016/5/9/chartex" xmlns:cx4="http://schemas.microsoft.com/office/drawing/2016/5/10/chartex" xmlns:cx5="http://schemas.microsoft.com/office/drawing/2016/5/11/chartex" xmlns:cx6="http://schemas.microsoft.com/office/drawing/2016/5/12/chartex" xmlns:cx7="http://schemas.microsoft.com/office/drawing/2016/5/13/chartex" xmlns:cx8="http://schemas.microsoft.com/office/drawing/2016/5/14/chartex" xmlns:mc="http://schemas.openxmlformats.org/markup-compatibility/2006" xmlns:aink="http://schemas.microsoft.com/office/drawing/2016/ink" xmlns:am3d="http://schemas.microsoft.com/office/drawing/2017/model3d" xmlns:o="urn:schemas-microsoft-com:office:office" xmlns:oel="http://schemas.microsoft.com/office/2019/extlst" xmlns:r="http://schemas.openxmlformats.org/officeDocument/2006/relationships" xmlns:m="http://schemas.openxmlformats.org/officeDocument/2006/math" xmlns:v="urn:schemas-microsoft-com:vml" xmlns:wp14="http://schemas.microsoft.com/office/word/2010/wordprocessingDrawing" xmlns:wp="http://schemas.openxmlformats.org/drawingml/2006/wordprocessingDrawing" xmlns:w10="urn:schemas-microsoft-com:office:word" xmlns:w="http://schemas.openxmlformats.org/wordprocessingml/2006/main" xmlns:w14="http://schemas.microsoft.com/office/word/2010/wordml" xmlns:w15="http://schemas.microsoft.com/office/word/2012/wordml" xmlns:w16cex="http://schemas.microsoft.com/office/word/2018/wordml/cex" xmlns:w16cid="http://schemas.microsoft.com/office/word/2016/wordml/cid" xmlns:w16="http://schemas.microsoft.com/office/word/2018/wordml" xmlns:w16du="http://schemas.microsoft.com/office/word/2023/wordml/word16du" xmlns:w16sdtdh="http://schemas.microsoft.com/office/word/2020/wordml/sdtdatahash" xmlns:w16sdtfl="http://schemas.microsoft.com/office/word/2024/wordml/sdtformatlock" xmlns:w16se="http://schemas.microsoft.com/office/word/2015/wordml/symex" xmlns:wpg="http://schemas.microsoft.com/office/word/2010/wordprocessingGroup" xmlns:wpi="http://schemas.microsoft.com/office/word/2010/wordprocessingInk" xmlns:wne="http://schemas.microsoft.com/office/word/2006/wordml" xmlns:wps="http://schemas.microsoft.com/office/word/2010/wordprocessingShape" mc:Ignorable="w14 w15 w16se w16cid w16 w16cex w16sdtdh w16sdtfl w16du wp14">
   <w:body>
     <w:p>
       <w:pPr>
-        <w:pStyle w:val="Heading1"/>
-        <w:rPr>
-          <w:lang w:val="en-US"/>
-        </w:rPr>
-      </w:pPr>
-      <w:r>
-        <w:rPr>
-          <w:lang w:val="pl-PL"/>
-        </w:rPr>
-        <w:t>MPC</w:t>
-      </w:r>
-      <w:r>
-        <w:rPr>
-          <w:lang w:val="en-US"/>
-        </w:rPr>
-        <w:t xml:space="preserve">-MAP Assignment No. </w:t>
-      </w:r>
-      <w:r>
-        <w:rPr>
-          <w:lang w:val="en-US"/>
-        </w:rPr>
-        <w:t>X</w:t>
-      </w:r>
-      <w:r>
-        <w:rPr>
-          <w:lang w:val="en-US"/>
-        </w:rPr>
+        <w:pStyle w:val="Nadpis1"/>
+      </w:pPr>
+      <w:r>
+        <w:t xml:space="preserve">MPC-MAP </w:t>
+      </w:r>
+      <w:proofErr w:type="spellStart"/>
+      <w:r>
+        <w:t>Assignment</w:t>
+      </w:r>
+      <w:proofErr w:type="spellEnd"/>
+      <w:r>
+        <w:t xml:space="preserve"> No. </w:t>
+      </w:r>
+      <w:r>
+        <w:t>4</w:t>
+      </w:r>
+      <w:r>
         <w:t xml:space="preserve"> - Report</w:t>
       </w:r>
     </w:p>
     <w:p>
       <w:pPr>
-        <w:pStyle w:val="Heading2"/>
-        <w:rPr>
-          <w:lang w:val="en-US"/>
-        </w:rPr>
-      </w:pPr>
+        <w:pStyle w:val="Nadpis2"/>
+      </w:pPr>
+      <w:proofErr w:type="spellStart"/>
       <w:r>
         <w:rPr>
           <w:b/>
           <w:bCs/>
-          <w:lang w:val="en-US"/>
         </w:rPr>
-        <w:t>Author:</w:t>
-      </w:r>
-      <w:r>
-        <w:rPr>
-          <w:lang w:val="en-US"/>
-        </w:rPr>
-        <w:t xml:space="preserve"> </w:t>
-      </w:r>
-      <w:r>
-        <w:rPr>
-          <w:lang w:val="en-US"/>
-        </w:rPr>
-        <w:tab/>
-      </w:r>
-      <w:r>
-        <w:rPr>
-          <w:lang w:val="en-US"/>
-        </w:rPr>
-        <w:t>Name</w:t>
-      </w:r>
-      <w:r>
-        <w:rPr>
-          <w:lang w:val="en-US"/>
-        </w:rPr>
-        <w:t xml:space="preserve"> </w:t>
-      </w:r>
-      <w:r>
-        <w:rPr>
-          <w:lang w:val="en-US"/>
-        </w:rPr>
-        <w:t>Surname</w:t>
-      </w:r>
-    </w:p>
-    <w:p>
-      <w:pPr>
-        <w:pStyle w:val="Heading2"/>
-        <w:rPr>
-          <w:lang w:val="en-US"/>
-        </w:rPr>
-      </w:pPr>
+        <w:t>Author</w:t>
+      </w:r>
+      <w:proofErr w:type="spellEnd"/>
       <w:r>
         <w:rPr>
           <w:b/>
           <w:bCs/>
-          <w:lang w:val="en-US"/>
         </w:rPr>
-        <w:t>Date:</w:t>
-      </w:r>
-      <w:r>
-        <w:rPr>
-          <w:lang w:val="en-US"/>
-        </w:rPr>
+        <w:t>:</w:t>
+      </w:r>
+      <w:r>
+        <w:t xml:space="preserve"> </w:t>
+      </w:r>
+      <w:r>
         <w:tab/>
       </w:r>
       <w:r>
-        <w:rPr>
-          <w:lang w:val="en-US"/>
-        </w:rPr>
+        <w:t>Dan Šrámek</w:t>
+      </w:r>
+      <w:r>
         <w:tab/>
       </w:r>
-      <w:r>
-        <w:rPr>
-          <w:lang w:val="en-US"/>
-        </w:rPr>
-        <w:t>xx</w:t>
-      </w:r>
-      <w:r>
-        <w:rPr>
-          <w:lang w:val="en-US"/>
-        </w:rPr>
-        <w:t xml:space="preserve"> </w:t>
-      </w:r>
-      <w:r>
-        <w:rPr>
-          <w:lang w:val="en-US"/>
-        </w:rPr>
-        <w:t>xxx</w:t>
-      </w:r>
-      <w:r>
-        <w:rPr>
-          <w:lang w:val="en-US"/>
-        </w:rPr>
-        <w:t xml:space="preserve"> </w:t>
-      </w:r>
-      <w:proofErr w:type="spellStart"/>
-      <w:r>
-        <w:rPr>
-          <w:lang w:val="en-US"/>
-        </w:rPr>
-        <w:t>xxxx</w:t>
-      </w:r>
-      <w:proofErr w:type="spellEnd"/>
     </w:p>
     <w:p>
       <w:pPr>
-        <w:pStyle w:val="Heading2"/>
+        <w:pStyle w:val="Nadpis2"/>
+      </w:pPr>
+      <w:proofErr w:type="spellStart"/>
+      <w:r>
         <w:rPr>
-          <w:lang w:val="en-US"/>
+          <w:b/>
+          <w:bCs/>
         </w:rPr>
-      </w:pPr>
+        <w:t>Date</w:t>
+      </w:r>
+      <w:proofErr w:type="spellEnd"/>
+      <w:r>
+        <w:rPr>
+          <w:b/>
+          <w:bCs/>
+        </w:rPr>
+        <w:t>:</w:t>
+      </w:r>
+      <w:r>
+        <w:tab/>
+      </w:r>
+      <w:r>
+        <w:tab/>
+      </w:r>
+      <w:r>
+        <w:t>18.04.2026</w:t>
+      </w:r>
     </w:p>
     <w:p>
       <w:pPr>
-        <w:pStyle w:val="Heading2"/>
-        <w:rPr>
-          <w:lang w:val="en-US"/>
-        </w:rPr>
-      </w:pPr>
-      <w:r>
-        <w:rPr>
-          <w:lang w:val="en-US"/>
-        </w:rPr>
-        <w:t>Task 1</w:t>
-      </w:r>
+        <w:pStyle w:val="Nadpis2"/>
+      </w:pPr>
     </w:p>
     <w:p>
       <w:pPr>
-        <w:rPr>
-          <w:lang w:val="en-US"/>
-        </w:rPr>
-      </w:pPr>
+        <w:pStyle w:val="Nadpis2"/>
+      </w:pPr>
+      <w:proofErr w:type="spellStart"/>
+      <w:r>
+        <w:t>Task</w:t>
+      </w:r>
+      <w:proofErr w:type="spellEnd"/>
+      <w:r>
+        <w:t xml:space="preserve"> 1</w:t>
+      </w:r>
     </w:p>
     <w:p>
-      <w:pPr>
-        <w:rPr>
-          <w:rFonts w:ascii="Times New Roman" w:eastAsia="Times New Roman" w:hAnsi="Times New Roman" w:cs="Times New Roman"/>
-          <w:lang w:eastAsia="en-GB"/>
-        </w:rPr>
-      </w:pPr>
-      <w:r>
+      <w:r>
+        <w:t>Inicializácia polohy bola implementovaná vo forme čakania variabilného množstva cyklov a následného výpočtu strednej hodnoty z histórie dát GNSS. Experimentálne bolo zistené, že minimum potrebných cyklov je 15. Tento počet zaistí pomerne presný, a medzi simuláciami konzistentný, odhad počiatočnej polohy.</w:t>
+      </w:r>
+    </w:p>
+    <w:p>
+      <w:pPr>
+        <w:pStyle w:val="Nadpis2"/>
+      </w:pPr>
+      <w:proofErr w:type="spellStart"/>
+      <w:r>
+        <w:t>Task</w:t>
+      </w:r>
+      <w:proofErr w:type="spellEnd"/>
+      <w:r>
+        <w:t xml:space="preserve"> 2</w:t>
+      </w:r>
+    </w:p>
+    <w:p>
+      <w:r>
+        <w:t xml:space="preserve">Funkcie </w:t>
+      </w:r>
+      <w:proofErr w:type="spellStart"/>
+      <w:r>
+        <w:t>ekf_predict</w:t>
+      </w:r>
+      <w:proofErr w:type="spellEnd"/>
+      <w:r>
+        <w:t xml:space="preserve"> a </w:t>
+      </w:r>
+      <w:proofErr w:type="spellStart"/>
+      <w:r>
+        <w:t>kf_measure</w:t>
+      </w:r>
+      <w:proofErr w:type="spellEnd"/>
+      <w:r>
+        <w:t xml:space="preserve"> boli implementované na základe podkladov z prezentácie.</w:t>
+      </w:r>
+    </w:p>
+    <w:p>
+      <w:pPr>
+        <w:pStyle w:val="Nadpis2"/>
+      </w:pPr>
+      <w:proofErr w:type="spellStart"/>
+      <w:r>
+        <w:t>Task</w:t>
+      </w:r>
+      <w:proofErr w:type="spellEnd"/>
+      <w:r>
+        <w:t xml:space="preserve"> 3</w:t>
+      </w:r>
+    </w:p>
+    <w:p>
+      <w:pPr>
         <w:rPr>
           <w:rFonts w:ascii="Open Sans" w:eastAsia="Times New Roman" w:hAnsi="Open Sans" w:cs="Open Sans"/>
           <w:color w:val="000000"/>
@@ -185,39 +167,8 @@
           <w:shd w:val="clear" w:color="auto" w:fill="FFFFFF"/>
           <w:lang w:eastAsia="en-GB"/>
         </w:rPr>
-        <w:t>Lorem ipsum dolor sit amet, consectetur adipiscing elit. Pellentesque faucibus, mi eu pellentesque venenatis, ligula leo tincidunt mauris, in tempus lectus erat eget purus. Fusce quis urna dolor. Phasellus tristique felis justo, vel consectetur magna luctus a. Nulla pharetra magna non pellentesque vestibulum.</w:t>
-      </w:r>
-    </w:p>
-    <w:p>
-      <w:pPr>
-        <w:rPr>
-          <w:lang w:val="en-US"/>
-        </w:rPr>
-      </w:pPr>
-    </w:p>
-    <w:p>
-      <w:pPr>
-        <w:pStyle w:val="Heading2"/>
-        <w:rPr>
-          <w:lang w:val="en-US"/>
-        </w:rPr>
-      </w:pPr>
-      <w:r>
-        <w:rPr>
-          <w:lang w:val="en-US"/>
-        </w:rPr>
-        <w:t>Task 2</w:t>
-      </w:r>
-    </w:p>
-    <w:p>
-      <w:pPr>
-        <w:rPr>
-          <w:lang w:val="en-US"/>
-        </w:rPr>
-      </w:pPr>
-    </w:p>
-    <w:p>
-      <w:pPr>
+      </w:pPr>
+      <w:r>
         <w:rPr>
           <w:rFonts w:ascii="Open Sans" w:eastAsia="Times New Roman" w:hAnsi="Open Sans" w:cs="Open Sans"/>
           <w:color w:val="000000"/>
@@ -226,138 +177,7 @@
           <w:shd w:val="clear" w:color="auto" w:fill="FFFFFF"/>
           <w:lang w:eastAsia="en-GB"/>
         </w:rPr>
-      </w:pPr>
-      <w:r>
-        <w:rPr>
-          <w:noProof/>
-        </w:rPr>
-        <mc:AlternateContent>
-          <mc:Choice Requires="wps">
-            <w:drawing>
-              <wp:anchor distT="0" distB="0" distL="114300" distR="114300" simplePos="0" relativeHeight="251669504" behindDoc="0" locked="0" layoutInCell="1" allowOverlap="1" wp14:anchorId="5A71B066" wp14:editId="6A4FFBF6">
-                <wp:simplePos x="0" y="0"/>
-                <wp:positionH relativeFrom="column">
-                  <wp:posOffset>1839595</wp:posOffset>
-                </wp:positionH>
-                <wp:positionV relativeFrom="paragraph">
-                  <wp:posOffset>2261235</wp:posOffset>
-                </wp:positionV>
-                <wp:extent cx="2023110" cy="635"/>
-                <wp:effectExtent l="0" t="0" r="0" b="12065"/>
-                <wp:wrapTopAndBottom/>
-                <wp:docPr id="9" name="Text Box 9"/>
-                <wp:cNvGraphicFramePr/>
-                <a:graphic xmlns:a="http://schemas.openxmlformats.org/drawingml/2006/main">
-                  <a:graphicData uri="http://schemas.microsoft.com/office/word/2010/wordprocessingShape">
-                    <wps:wsp>
-                      <wps:cNvSpPr txBox="1"/>
-                      <wps:spPr>
-                        <a:xfrm>
-                          <a:off x="0" y="0"/>
-                          <a:ext cx="2023110" cy="635"/>
-                        </a:xfrm>
-                        <a:prstGeom prst="rect">
-                          <a:avLst/>
-                        </a:prstGeom>
-                        <a:solidFill>
-                          <a:prstClr val="white"/>
-                        </a:solidFill>
-                        <a:ln>
-                          <a:noFill/>
-                        </a:ln>
-                      </wps:spPr>
-                      <wps:txbx>
-                        <w:txbxContent>
-                          <w:p>
-                            <w:pPr>
-                              <w:pStyle w:val="Caption"/>
-                              <w:jc w:val="center"/>
-                              <w:rPr>
-                                <w:rFonts w:ascii="Open Sans" w:eastAsia="Times New Roman" w:hAnsi="Open Sans" w:cs="Open Sans"/>
-                                <w:color w:val="000000"/>
-                                <w:sz w:val="21"/>
-                                <w:szCs w:val="21"/>
-                                <w:shd w:val="clear" w:color="auto" w:fill="FFFFFF"/>
-                              </w:rPr>
-                            </w:pPr>
-                            <w:r>
-                              <w:t xml:space="preserve">Figure </w:t>
-                            </w:r>
-                            <w:fldSimple w:instr=" SEQ Figure \* ARABIC ">
-                              <w:r>
-                                <w:rPr>
-                                  <w:noProof/>
-                                </w:rPr>
-                                <w:t>1</w:t>
-                              </w:r>
-                            </w:fldSimple>
-                            <w:r>
-                              <w:rPr>
-                                <w:lang w:val="en-US"/>
-                              </w:rPr>
-                              <w:t xml:space="preserve"> - Lorem Ipsum</w:t>
-                            </w:r>
-                          </w:p>
-                        </w:txbxContent>
-                      </wps:txbx>
-                      <wps:bodyPr rot="0" spcFirstLastPara="0" vertOverflow="overflow" horzOverflow="overflow" vert="horz" wrap="square" lIns="0" tIns="0" rIns="0" bIns="0" numCol="1" spcCol="0" rtlCol="0" fromWordArt="0" anchor="t" anchorCtr="0" forceAA="0" compatLnSpc="1">
-                        <a:prstTxWarp prst="textNoShape">
-                          <a:avLst/>
-                        </a:prstTxWarp>
-                        <a:spAutoFit/>
-                      </wps:bodyPr>
-                    </wps:wsp>
-                  </a:graphicData>
-                </a:graphic>
-              </wp:anchor>
-            </w:drawing>
-          </mc:Choice>
-          <mc:Fallback>
-            <w:pict>
-              <v:shapetype w14:anchorId="5A71B066" id="_x0000_t202" coordsize="21600,21600" o:spt="202" path="m,l,21600r21600,l21600,xe">
-                <v:stroke joinstyle="miter"/>
-                <v:path gradientshapeok="t" o:connecttype="rect"/>
-              </v:shapetype>
-              <v:shape id="Text Box 9" o:spid="_x0000_s1026" type="#_x0000_t202" style="position:absolute;margin-left:144.85pt;margin-top:178.05pt;width:159.3pt;height:.05pt;z-index:251669504;visibility:visible;mso-wrap-style:square;mso-wrap-distance-left:9pt;mso-wrap-distance-top:0;mso-wrap-distance-right:9pt;mso-wrap-distance-bottom:0;mso-position-horizontal:absolute;mso-position-horizontal-relative:text;mso-position-vertical:absolute;mso-position-vertical-relative:text;v-text-anchor:top" o:gfxdata="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" stroked="f">
-                <v:textbox style="mso-fit-shape-to-text:t" inset="0,0,0,0">
-                  <w:txbxContent>
-                    <w:p>
-                      <w:pPr>
-                        <w:pStyle w:val="Caption"/>
-                        <w:jc w:val="center"/>
-                        <w:rPr>
-                          <w:rFonts w:ascii="Open Sans" w:eastAsia="Times New Roman" w:hAnsi="Open Sans" w:cs="Open Sans"/>
-                          <w:color w:val="000000"/>
-                          <w:sz w:val="21"/>
-                          <w:szCs w:val="21"/>
-                          <w:shd w:val="clear" w:color="auto" w:fill="FFFFFF"/>
-                        </w:rPr>
-                      </w:pPr>
-                      <w:r>
-                        <w:t xml:space="preserve">Figure </w:t>
-                      </w:r>
-                      <w:fldSimple w:instr=" SEQ Figure \* ARABIC ">
-                        <w:r>
-                          <w:rPr>
-                            <w:noProof/>
-                          </w:rPr>
-                          <w:t>1</w:t>
-                        </w:r>
-                      </w:fldSimple>
-                      <w:r>
-                        <w:rPr>
-                          <w:lang w:val="en-US"/>
-                        </w:rPr>
-                        <w:t xml:space="preserve"> - Lorem Ipsum</w:t>
-                      </w:r>
-                    </w:p>
-                  </w:txbxContent>
-                </v:textbox>
-                <w10:wrap type="topAndBottom"/>
-              </v:shape>
-            </w:pict>
-          </mc:Fallback>
-        </mc:AlternateContent>
+        <w:t>Vďaka konzistentnej počiatočnej polohe bola matica procesných šumov určená ako</w:t>
       </w:r>
       <w:r>
         <w:rPr>
@@ -368,388 +188,212 @@
           <w:shd w:val="clear" w:color="auto" w:fill="FFFFFF"/>
           <w:lang w:eastAsia="en-GB"/>
         </w:rPr>
-        <w:drawing>
-          <wp:anchor distT="0" distB="0" distL="114300" distR="114300" simplePos="0" relativeHeight="251667456" behindDoc="0" locked="0" layoutInCell="1" allowOverlap="1" wp14:anchorId="4ADA1C2F" wp14:editId="1B13B3B8">
-            <wp:simplePos x="0" y="0"/>
-            <wp:positionH relativeFrom="column">
-              <wp:posOffset>1839632</wp:posOffset>
-            </wp:positionH>
-            <wp:positionV relativeFrom="paragraph">
-              <wp:posOffset>795618</wp:posOffset>
-            </wp:positionV>
-            <wp:extent cx="2023110" cy="1409065"/>
-            <wp:effectExtent l="0" t="0" r="0" b="635"/>
-            <wp:wrapTopAndBottom/>
-            <wp:docPr id="2" name="Picture 7" descr="Chart, line chart&#10;&#10;Description automatically generated">
-              <a:extLst xmlns:a="http://schemas.openxmlformats.org/drawingml/2006/main">
-                <a:ext uri="{FF2B5EF4-FFF2-40B4-BE49-F238E27FC236}">
-                  <a16:creationId xmlns:a16="http://schemas.microsoft.com/office/drawing/2014/main" id="{7C29043C-20ED-6E4B-B766-D8F2F146FC5B}"/>
-                </a:ext>
-              </a:extLst>
-            </wp:docPr>
-            <wp:cNvGraphicFramePr>
-              <a:graphicFrameLocks xmlns:a="http://schemas.openxmlformats.org/drawingml/2006/main" noChangeAspect="1"/>
-            </wp:cNvGraphicFramePr>
-            <a:graphic xmlns:a="http://schemas.openxmlformats.org/drawingml/2006/main">
-              <a:graphicData uri="http://schemas.openxmlformats.org/drawingml/2006/picture">
-                <pic:pic xmlns:pic="http://schemas.openxmlformats.org/drawingml/2006/picture">
-                  <pic:nvPicPr>
-                    <pic:cNvPr id="8" name="Picture 7" descr="Chart, line chart&#10;&#10;Description automatically generated">
-                      <a:extLst>
-                        <a:ext uri="{FF2B5EF4-FFF2-40B4-BE49-F238E27FC236}">
-                          <a16:creationId xmlns:a16="http://schemas.microsoft.com/office/drawing/2014/main" id="{7C29043C-20ED-6E4B-B766-D8F2F146FC5B}"/>
-                        </a:ext>
-                      </a:extLst>
-                    </pic:cNvPr>
-                    <pic:cNvPicPr>
-                      <a:picLocks noChangeAspect="1"/>
-                    </pic:cNvPicPr>
-                  </pic:nvPicPr>
-                  <pic:blipFill>
-                    <a:blip r:embed="rId7" cstate="print">
-                      <a:extLst>
-                        <a:ext uri="{28A0092B-C50C-407E-A947-70E740481C1C}">
-                          <a14:useLocalDpi xmlns:a14="http://schemas.microsoft.com/office/drawing/2010/main" val="0"/>
-                        </a:ext>
-                      </a:extLst>
-                    </a:blip>
-                    <a:stretch>
-                      <a:fillRect/>
-                    </a:stretch>
-                  </pic:blipFill>
-                  <pic:spPr>
-                    <a:xfrm>
-                      <a:off x="0" y="0"/>
-                      <a:ext cx="2023110" cy="1409065"/>
-                    </a:xfrm>
-                    <a:prstGeom prst="rect">
-                      <a:avLst/>
-                    </a:prstGeom>
-                  </pic:spPr>
-                </pic:pic>
-              </a:graphicData>
-            </a:graphic>
-            <wp14:sizeRelH relativeFrom="page">
-              <wp14:pctWidth>0</wp14:pctWidth>
-            </wp14:sizeRelH>
-            <wp14:sizeRelV relativeFrom="page">
-              <wp14:pctHeight>0</wp14:pctHeight>
-            </wp14:sizeRelV>
-          </wp:anchor>
-        </w:drawing>
-      </w:r>
-      <w:r>
-        <w:rPr>
-          <w:rFonts w:ascii="Open Sans" w:eastAsia="Times New Roman" w:hAnsi="Open Sans" w:cs="Open Sans"/>
-          <w:color w:val="000000"/>
-          <w:sz w:val="21"/>
-          <w:szCs w:val="21"/>
-          <w:shd w:val="clear" w:color="auto" w:fill="FFFFFF"/>
-          <w:lang w:eastAsia="en-GB"/>
-        </w:rPr>
-        <w:t>Lorem ipsum dolor sit amet, consectetur adipiscing elit. Pellentesque faucibus, mi eu pellentesque venenatis, ligula leo tincidunt mauris, in tempus lectus erat eget purus. Fusce quis urna dolor. Phasellus tristique felis justo, vel consectetur magna luctus a. Nulla pharetra magna non pellentesque vestibulum.</w:t>
-      </w:r>
-      <w:r>
-        <w:rPr>
-          <w:noProof/>
-        </w:rPr>
-        <w:t xml:space="preserve"> </w:t>
-      </w:r>
+        <w:br/>
+      </w:r>
+      <m:oMathPara>
+        <m:oMath>
+          <m:m>
+            <m:mPr>
+              <m:mcs>
+                <m:mc>
+                  <m:mcPr>
+                    <m:count m:val="3"/>
+                    <m:mcJc m:val="center"/>
+                  </m:mcPr>
+                </m:mc>
+              </m:mcs>
+              <m:ctrlPr>
+                <w:rPr>
+                  <w:rFonts w:ascii="Cambria Math" w:eastAsia="Times New Roman" w:hAnsi="Cambria Math" w:cs="Open Sans"/>
+                  <w:color w:val="000000"/>
+                  <w:sz w:val="21"/>
+                  <w:szCs w:val="21"/>
+                  <w:shd w:val="clear" w:color="auto" w:fill="FFFFFF"/>
+                  <w:lang w:val="en-US" w:eastAsia="en-GB"/>
+                </w:rPr>
+              </m:ctrlPr>
+            </m:mPr>
+            <m:mr>
+              <m:e>
+                <m:r>
+                  <w:rPr>
+                    <w:rFonts w:ascii="Cambria Math" w:eastAsia="Times New Roman" w:hAnsi="Cambria Math" w:cs="Open Sans"/>
+                    <w:color w:val="000000"/>
+                    <w:sz w:val="21"/>
+                    <w:szCs w:val="21"/>
+                    <w:shd w:val="clear" w:color="auto" w:fill="FFFFFF"/>
+                    <w:lang w:val="en-US" w:eastAsia="en-GB"/>
+                  </w:rPr>
+                  <m:t>0.005^2</m:t>
+                </m:r>
+              </m:e>
+              <m:e>
+                <m:r>
+                  <w:rPr>
+                    <w:rFonts w:ascii="Cambria Math" w:eastAsia="Times New Roman" w:hAnsi="Cambria Math" w:cs="Open Sans"/>
+                    <w:color w:val="000000"/>
+                    <w:sz w:val="21"/>
+                    <w:szCs w:val="21"/>
+                    <w:shd w:val="clear" w:color="auto" w:fill="FFFFFF"/>
+                    <w:lang w:val="en-US" w:eastAsia="en-GB"/>
+                  </w:rPr>
+                  <m:t>0</m:t>
+                </m:r>
+              </m:e>
+              <m:e>
+                <m:r>
+                  <w:rPr>
+                    <w:rFonts w:ascii="Cambria Math" w:eastAsia="Times New Roman" w:hAnsi="Cambria Math" w:cs="Open Sans"/>
+                    <w:color w:val="000000"/>
+                    <w:sz w:val="21"/>
+                    <w:szCs w:val="21"/>
+                    <w:shd w:val="clear" w:color="auto" w:fill="FFFFFF"/>
+                    <w:lang w:val="en-US" w:eastAsia="en-GB"/>
+                  </w:rPr>
+                  <m:t>0</m:t>
+                </m:r>
+              </m:e>
+            </m:mr>
+            <m:mr>
+              <m:e>
+                <m:r>
+                  <w:rPr>
+                    <w:rFonts w:ascii="Cambria Math" w:eastAsia="Times New Roman" w:hAnsi="Cambria Math" w:cs="Open Sans"/>
+                    <w:color w:val="000000"/>
+                    <w:sz w:val="21"/>
+                    <w:szCs w:val="21"/>
+                    <w:shd w:val="clear" w:color="auto" w:fill="FFFFFF"/>
+                    <w:lang w:val="en-US" w:eastAsia="en-GB"/>
+                  </w:rPr>
+                  <m:t>0</m:t>
+                </m:r>
+              </m:e>
+              <m:e>
+                <m:r>
+                  <w:rPr>
+                    <w:rFonts w:ascii="Cambria Math" w:eastAsia="Times New Roman" w:hAnsi="Cambria Math" w:cs="Open Sans"/>
+                    <w:color w:val="000000"/>
+                    <w:sz w:val="21"/>
+                    <w:szCs w:val="21"/>
+                    <w:shd w:val="clear" w:color="auto" w:fill="FFFFFF"/>
+                    <w:lang w:val="en-US" w:eastAsia="en-GB"/>
+                  </w:rPr>
+                  <m:t>0.02^2</m:t>
+                </m:r>
+              </m:e>
+              <m:e>
+                <m:r>
+                  <w:rPr>
+                    <w:rFonts w:ascii="Cambria Math" w:eastAsia="Times New Roman" w:hAnsi="Cambria Math" w:cs="Open Sans"/>
+                    <w:color w:val="000000"/>
+                    <w:sz w:val="21"/>
+                    <w:szCs w:val="21"/>
+                    <w:shd w:val="clear" w:color="auto" w:fill="FFFFFF"/>
+                    <w:lang w:val="en-US" w:eastAsia="en-GB"/>
+                  </w:rPr>
+                  <m:t>0</m:t>
+                </m:r>
+              </m:e>
+            </m:mr>
+            <m:mr>
+              <m:e>
+                <m:r>
+                  <w:rPr>
+                    <w:rFonts w:ascii="Cambria Math" w:eastAsia="Times New Roman" w:hAnsi="Cambria Math" w:cs="Open Sans"/>
+                    <w:color w:val="000000"/>
+                    <w:sz w:val="21"/>
+                    <w:szCs w:val="21"/>
+                    <w:shd w:val="clear" w:color="auto" w:fill="FFFFFF"/>
+                    <w:lang w:val="en-US" w:eastAsia="en-GB"/>
+                  </w:rPr>
+                  <m:t>0</m:t>
+                </m:r>
+              </m:e>
+              <m:e>
+                <m:r>
+                  <w:rPr>
+                    <w:rFonts w:ascii="Cambria Math" w:eastAsia="Times New Roman" w:hAnsi="Cambria Math" w:cs="Open Sans"/>
+                    <w:color w:val="000000"/>
+                    <w:sz w:val="21"/>
+                    <w:szCs w:val="21"/>
+                    <w:shd w:val="clear" w:color="auto" w:fill="FFFFFF"/>
+                    <w:lang w:val="en-US" w:eastAsia="en-GB"/>
+                  </w:rPr>
+                  <m:t>0</m:t>
+                </m:r>
+              </m:e>
+              <m:e>
+                <m:r>
+                  <w:rPr>
+                    <w:rFonts w:ascii="Cambria Math" w:eastAsia="Times New Roman" w:hAnsi="Cambria Math" w:cs="Open Sans"/>
+                    <w:color w:val="000000"/>
+                    <w:sz w:val="21"/>
+                    <w:szCs w:val="21"/>
+                    <w:shd w:val="clear" w:color="auto" w:fill="FFFFFF"/>
+                    <w:lang w:val="en-US" w:eastAsia="en-GB"/>
+                  </w:rPr>
+                  <m:t>0.05^2</m:t>
+                </m:r>
+              </m:e>
+            </m:mr>
+          </m:m>
+        </m:oMath>
+      </m:oMathPara>
     </w:p>
     <w:p>
-      <w:pPr>
-        <w:pStyle w:val="Heading2"/>
+      <w:r>
+        <w:t>Tu je možné vidieť, že neistota v bočnom pohybe a rotácii je značne vyššia ako neistota v </w:t>
+      </w:r>
+      <w:proofErr w:type="spellStart"/>
+      <w:r>
+        <w:t>doprednom</w:t>
+      </w:r>
+      <w:proofErr w:type="spellEnd"/>
+      <w:r>
+        <w:t xml:space="preserve"> pohybe robota.</w:t>
+      </w:r>
+      <w:r>
+        <w:br/>
+        <w:t xml:space="preserve">Matica šumov merania bola určená ako </w:t>
+      </w:r>
+      <w:proofErr w:type="spellStart"/>
+      <w:r>
+        <w:t>kovariančná</w:t>
+      </w:r>
+      <w:proofErr w:type="spellEnd"/>
+      <w:r>
+        <w:t xml:space="preserve"> matica GNSS.</w:t>
+      </w:r>
+    </w:p>
+    <w:p/>
+    <w:p>
+      <w:pPr>
+        <w:pStyle w:val="Nadpis2"/>
+      </w:pPr>
+      <w:proofErr w:type="spellStart"/>
+      <w:r>
+        <w:t>Task</w:t>
+      </w:r>
+      <w:proofErr w:type="spellEnd"/>
+      <w:r>
+        <w:t xml:space="preserve"> </w:t>
+      </w:r>
+      <w:r>
+        <w:t>4</w:t>
+      </w:r>
+    </w:p>
+    <w:p>
+      <w:pPr>
         <w:rPr>
           <w:lang w:val="en-US"/>
         </w:rPr>
       </w:pPr>
       <w:r>
-        <w:rPr>
-          <w:lang w:val="en-US"/>
-        </w:rPr>
-        <w:t>Task 3</w:t>
-      </w:r>
-    </w:p>
-    <w:p>
-      <w:pPr>
-        <w:rPr>
-          <w:lang w:val="en-US"/>
-        </w:rPr>
-      </w:pPr>
-    </w:p>
-    <w:p>
-      <w:pPr>
-        <w:rPr>
-          <w:rFonts w:cs="Arial"/>
-        </w:rPr>
-      </w:pPr>
-      <w:r>
-        <w:rPr>
-          <w:noProof/>
-        </w:rPr>
-        <mc:AlternateContent>
-          <mc:Choice Requires="wps">
-            <w:drawing>
-              <wp:anchor distT="0" distB="0" distL="114300" distR="114300" simplePos="0" relativeHeight="251666432" behindDoc="0" locked="0" layoutInCell="1" allowOverlap="1" wp14:anchorId="031C5F84" wp14:editId="4E61C6C3">
-                <wp:simplePos x="0" y="0"/>
-                <wp:positionH relativeFrom="column">
-                  <wp:posOffset>873760</wp:posOffset>
-                </wp:positionH>
-                <wp:positionV relativeFrom="paragraph">
-                  <wp:posOffset>2332355</wp:posOffset>
-                </wp:positionV>
-                <wp:extent cx="4249420" cy="635"/>
-                <wp:effectExtent l="0" t="0" r="5080" b="12065"/>
-                <wp:wrapTopAndBottom/>
-                <wp:docPr id="8" name="Text Box 8"/>
-                <wp:cNvGraphicFramePr/>
-                <a:graphic xmlns:a="http://schemas.openxmlformats.org/drawingml/2006/main">
-                  <a:graphicData uri="http://schemas.microsoft.com/office/word/2010/wordprocessingShape">
-                    <wps:wsp>
-                      <wps:cNvSpPr txBox="1"/>
-                      <wps:spPr>
-                        <a:xfrm>
-                          <a:off x="0" y="0"/>
-                          <a:ext cx="4249420" cy="635"/>
-                        </a:xfrm>
-                        <a:prstGeom prst="rect">
-                          <a:avLst/>
-                        </a:prstGeom>
-                        <a:solidFill>
-                          <a:prstClr val="white"/>
-                        </a:solidFill>
-                        <a:ln>
-                          <a:noFill/>
-                        </a:ln>
-                      </wps:spPr>
-                      <wps:txbx>
-                        <w:txbxContent>
-                          <w:p>
-                            <w:pPr>
-                              <w:pStyle w:val="Caption"/>
-                              <w:jc w:val="center"/>
-                              <w:rPr>
-                                <w:noProof/>
-                                <w:lang w:val="en-US"/>
-                              </w:rPr>
-                            </w:pPr>
-                            <w:r>
-                              <w:t xml:space="preserve">Figure </w:t>
-                            </w:r>
-                            <w:fldSimple w:instr=" SEQ Figure \* ARABIC ">
-                              <w:r>
-                                <w:rPr>
-                                  <w:noProof/>
-                                </w:rPr>
-                                <w:t>2</w:t>
-                              </w:r>
-                            </w:fldSimple>
-                            <w:r>
-                              <w:rPr>
-                                <w:lang w:val="en-US"/>
-                              </w:rPr>
-                              <w:t xml:space="preserve"> - Lorem Ipsum</w:t>
-                            </w:r>
-                          </w:p>
-                        </w:txbxContent>
-                      </wps:txbx>
-                      <wps:bodyPr rot="0" spcFirstLastPara="0" vertOverflow="overflow" horzOverflow="overflow" vert="horz" wrap="square" lIns="0" tIns="0" rIns="0" bIns="0" numCol="1" spcCol="0" rtlCol="0" fromWordArt="0" anchor="t" anchorCtr="0" forceAA="0" compatLnSpc="1">
-                        <a:prstTxWarp prst="textNoShape">
-                          <a:avLst/>
-                        </a:prstTxWarp>
-                        <a:spAutoFit/>
-                      </wps:bodyPr>
-                    </wps:wsp>
-                  </a:graphicData>
-                </a:graphic>
-              </wp:anchor>
-            </w:drawing>
-          </mc:Choice>
-          <mc:Fallback>
-            <w:pict>
-              <v:shape w14:anchorId="031C5F84" id="Text Box 8" o:spid="_x0000_s1027" type="#_x0000_t202" style="position:absolute;margin-left:68.8pt;margin-top:183.65pt;width:334.6pt;height:.05pt;z-index:251666432;visibility:visible;mso-wrap-style:square;mso-wrap-distance-left:9pt;mso-wrap-distance-top:0;mso-wrap-distance-right:9pt;mso-wrap-distance-bottom:0;mso-position-horizontal:absolute;mso-position-horizontal-relative:text;mso-position-vertical:absolute;mso-position-vertical-relative:text;v-text-anchor:top" o:gfxdata="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" stroked="f">
-                <v:textbox style="mso-fit-shape-to-text:t" inset="0,0,0,0">
-                  <w:txbxContent>
-                    <w:p>
-                      <w:pPr>
-                        <w:pStyle w:val="Caption"/>
-                        <w:jc w:val="center"/>
-                        <w:rPr>
-                          <w:noProof/>
-                          <w:lang w:val="en-US"/>
-                        </w:rPr>
-                      </w:pPr>
-                      <w:r>
-                        <w:t xml:space="preserve">Figure </w:t>
-                      </w:r>
-                      <w:fldSimple w:instr=" SEQ Figure \* ARABIC ">
-                        <w:r>
-                          <w:rPr>
-                            <w:noProof/>
-                          </w:rPr>
-                          <w:t>2</w:t>
-                        </w:r>
-                      </w:fldSimple>
-                      <w:r>
-                        <w:rPr>
-                          <w:lang w:val="en-US"/>
-                        </w:rPr>
-                        <w:t xml:space="preserve"> - Lorem Ipsum</w:t>
-                      </w:r>
-                    </w:p>
-                  </w:txbxContent>
-                </v:textbox>
-                <w10:wrap type="topAndBottom"/>
-              </v:shape>
-            </w:pict>
-          </mc:Fallback>
-        </mc:AlternateContent>
-      </w:r>
-      <w:r>
-        <w:rPr>
-          <w:noProof/>
-          <w:lang w:val="en-US"/>
-        </w:rPr>
-        <mc:AlternateContent>
-          <mc:Choice Requires="wpg">
-            <w:drawing>
-              <wp:anchor distT="0" distB="0" distL="114300" distR="114300" simplePos="0" relativeHeight="251662336" behindDoc="0" locked="0" layoutInCell="1" allowOverlap="1" wp14:anchorId="12153202" wp14:editId="4E2FF224">
-                <wp:simplePos x="0" y="0"/>
-                <wp:positionH relativeFrom="column">
-                  <wp:posOffset>874111</wp:posOffset>
-                </wp:positionH>
-                <wp:positionV relativeFrom="paragraph">
-                  <wp:posOffset>877526</wp:posOffset>
-                </wp:positionV>
-                <wp:extent cx="4249552" cy="1487170"/>
-                <wp:effectExtent l="0" t="0" r="5080" b="0"/>
-                <wp:wrapTopAndBottom/>
-                <wp:docPr id="6" name="Group 6"/>
-                <wp:cNvGraphicFramePr/>
-                <a:graphic xmlns:a="http://schemas.openxmlformats.org/drawingml/2006/main">
-                  <a:graphicData uri="http://schemas.microsoft.com/office/word/2010/wordprocessingGroup">
-                    <wpg:wgp>
-                      <wpg:cNvGrpSpPr/>
-                      <wpg:grpSpPr>
-                        <a:xfrm>
-                          <a:off x="0" y="0"/>
-                          <a:ext cx="4249552" cy="1487170"/>
-                          <a:chOff x="0" y="0"/>
-                          <a:chExt cx="4249552" cy="1487170"/>
-                        </a:xfrm>
-                      </wpg:grpSpPr>
-                      <pic:pic xmlns:pic="http://schemas.openxmlformats.org/drawingml/2006/picture">
-                        <pic:nvPicPr>
-                          <pic:cNvPr id="4" name="Picture 4" descr="Chart, line chart&#10;&#10;Description automatically generated"/>
-                          <pic:cNvPicPr>
-                            <a:picLocks noChangeAspect="1"/>
-                          </pic:cNvPicPr>
-                        </pic:nvPicPr>
-                        <pic:blipFill>
-                          <a:blip r:embed="rId8" cstate="print">
-                            <a:extLst>
-                              <a:ext uri="{28A0092B-C50C-407E-A947-70E740481C1C}">
-                                <a14:useLocalDpi xmlns:a14="http://schemas.microsoft.com/office/drawing/2010/main" val="0"/>
-                              </a:ext>
-                            </a:extLst>
-                          </a:blip>
-                          <a:stretch>
-                            <a:fillRect/>
-                          </a:stretch>
-                        </pic:blipFill>
-                        <pic:spPr>
-                          <a:xfrm>
-                            <a:off x="0" y="10510"/>
-                            <a:ext cx="2049145" cy="1474470"/>
-                          </a:xfrm>
-                          <a:prstGeom prst="rect">
-                            <a:avLst/>
-                          </a:prstGeom>
-                        </pic:spPr>
-                      </pic:pic>
-                      <pic:pic xmlns:pic="http://schemas.openxmlformats.org/drawingml/2006/picture">
-                        <pic:nvPicPr>
-                          <pic:cNvPr id="5" name="Picture 5" descr="Chart, line chart&#10;&#10;Description automatically generated"/>
-                          <pic:cNvPicPr>
-                            <a:picLocks noChangeAspect="1"/>
-                          </pic:cNvPicPr>
-                        </pic:nvPicPr>
-                        <pic:blipFill>
-                          <a:blip r:embed="rId9" cstate="print">
-                            <a:extLst>
-                              <a:ext uri="{28A0092B-C50C-407E-A947-70E740481C1C}">
-                                <a14:useLocalDpi xmlns:a14="http://schemas.microsoft.com/office/drawing/2010/main" val="0"/>
-                              </a:ext>
-                            </a:extLst>
-                          </a:blip>
-                          <a:stretch>
-                            <a:fillRect/>
-                          </a:stretch>
-                        </pic:blipFill>
-                        <pic:spPr>
-                          <a:xfrm>
-                            <a:off x="2175642" y="0"/>
-                            <a:ext cx="2073910" cy="1487170"/>
-                          </a:xfrm>
-                          <a:prstGeom prst="rect">
-                            <a:avLst/>
-                          </a:prstGeom>
-                        </pic:spPr>
-                      </pic:pic>
-                    </wpg:wgp>
-                  </a:graphicData>
-                </a:graphic>
-              </wp:anchor>
-            </w:drawing>
-          </mc:Choice>
-          <mc:Fallback>
-            <w:pict>
-              <v:group w14:anchorId="2E45FCA0" id="Group 6" o:spid="_x0000_s1026" style="position:absolute;margin-left:68.85pt;margin-top:69.1pt;width:334.6pt;height:117.1pt;z-index:251662336" coordsize="42495,14871" o:gfxdata="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">
-                <v:shapetype id="_x0000_t75" coordsize="21600,21600" o:spt="75" o:preferrelative="t" path="m@4@5l@4@11@9@11@9@5xe" filled="f" stroked="f">
-                  <v:stroke joinstyle="miter"/>
-                  <v:formulas>
-                    <v:f eqn="if lineDrawn pixelLineWidth 0"/>
-                    <v:f eqn="sum @0 1 0"/>
-                    <v:f eqn="sum 0 0 @1"/>
-                    <v:f eqn="prod @2 1 2"/>
-                    <v:f eqn="prod @3 21600 pixelWidth"/>
-                    <v:f eqn="prod @3 21600 pixelHeight"/>
-                    <v:f eqn="sum @0 0 1"/>
-                    <v:f eqn="prod @6 1 2"/>
-                    <v:f eqn="prod @7 21600 pixelWidth"/>
-                    <v:f eqn="sum @8 21600 0"/>
-                    <v:f eqn="prod @7 21600 pixelHeight"/>
-                    <v:f eqn="sum @10 21600 0"/>
-                  </v:formulas>
-                  <v:path o:extrusionok="f" gradientshapeok="t" o:connecttype="rect"/>
-                  <o:lock v:ext="edit" aspectratio="t"/>
-                </v:shapetype>
-                <v:shape id="Picture 4" o:spid="_x0000_s1027" type="#_x0000_t75" alt="Chart, line chart&#10;&#10;Description automatically generated" style="position:absolute;top:105;width:20491;height:14744;visibility:visible;mso-wrap-style:square" o:gfxdata="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">
-                  <v:imagedata r:id="rId11" o:title="Chart, line chart&#10;&#10;Description automatically generated"/>
-                </v:shape>
-                <v:shape id="Picture 5" o:spid="_x0000_s1028" type="#_x0000_t75" alt="Chart, line chart&#10;&#10;Description automatically generated" style="position:absolute;left:21756;width:20739;height:14871;visibility:visible;mso-wrap-style:square" o:gfxdata="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">
-                  <v:imagedata r:id="rId12" o:title="Chart, line chart&#10;&#10;Description automatically generated"/>
-                </v:shape>
-                <w10:wrap type="topAndBottom"/>
-              </v:group>
-            </w:pict>
-          </mc:Fallback>
-        </mc:AlternateContent>
-      </w:r>
-      <w:r>
-        <w:rPr>
-          <w:rFonts w:ascii="Open Sans" w:eastAsia="Times New Roman" w:hAnsi="Open Sans" w:cs="Open Sans"/>
-          <w:color w:val="000000"/>
-          <w:sz w:val="21"/>
-          <w:szCs w:val="21"/>
-          <w:shd w:val="clear" w:color="auto" w:fill="FFFFFF"/>
-          <w:lang w:eastAsia="en-GB"/>
-        </w:rPr>
-        <w:t>Lorem ipsum dolor sit amet, consectetur adipiscing elit. Pellentesque faucibus, mi eu pellentesque venenatis, ligula leo tincidunt mauris, in tempus lectus erat eget purus. Fusce quis urna dolor. Phasellus tristique felis justo, vel consectetur magna luctus a. Nulla pharetra magna non pellentesque ve</w:t>
+        <w:t xml:space="preserve">V </w:t>
       </w:r>
     </w:p>
     <w:sectPr>
-      <w:headerReference w:type="default" r:id="rId13"/>
+      <w:headerReference w:type="default" r:id="rId7"/>
       <w:pgSz w:w="11906" w:h="16838"/>
       <w:pgMar w:top="1440" w:right="1440" w:bottom="1440" w:left="1440" w:header="708" w:footer="708" w:gutter="0"/>
       <w:cols w:space="708"/>
@@ -760,7 +404,7 @@
 </file>
 
 <file path=word/endnotes.xml><?xml version="1.0" encoding="utf-8"?>
-<w:endnotes xmlns:wpc="http://schemas.microsoft.com/office/word/2010/wordprocessingCanvas" xmlns:cx="http://schemas.microsoft.com/office/drawing/2014/chartex" xmlns:cx1="http://schemas.microsoft.com/office/drawing/2015/9/8/chartex" xmlns:cx2="http://schemas.microsoft.com/office/drawing/2015/10/21/chartex" xmlns:cx3="http://schemas.microsoft.com/office/drawing/2016/5/9/chartex" xmlns:cx4="http://schemas.microsoft.com/office/drawing/2016/5/10/chartex" xmlns:cx5="http://schemas.microsoft.com/office/drawing/2016/5/11/chartex" xmlns:cx6="http://schemas.microsoft.com/office/drawing/2016/5/12/chartex" xmlns:cx7="http://schemas.microsoft.com/office/drawing/2016/5/13/chartex" xmlns:cx8="http://schemas.microsoft.com/office/drawing/2016/5/14/chartex" xmlns:mc="http://schemas.openxmlformats.org/markup-compatibility/2006" xmlns:aink="http://schemas.microsoft.com/office/drawing/2016/ink" xmlns:am3d="http://schemas.microsoft.com/office/drawing/2017/model3d" xmlns:o="urn:schemas-microsoft-com:office:office" xmlns:r="http://schemas.openxmlformats.org/officeDocument/2006/relationships" xmlns:m="http://schemas.openxmlformats.org/officeDocument/2006/math" xmlns:v="urn:schemas-microsoft-com:vml" xmlns:wp14="http://schemas.microsoft.com/office/word/2010/wordprocessingDrawing" xmlns:wp="http://schemas.openxmlformats.org/drawingml/2006/wordprocessingDrawing" xmlns:w10="urn:schemas-microsoft-com:office:word" xmlns:w="http://schemas.openxmlformats.org/wordprocessingml/2006/main" xmlns:w14="http://schemas.microsoft.com/office/word/2010/wordml" xmlns:w15="http://schemas.microsoft.com/office/word/2012/wordml" xmlns:w16cex="http://schemas.microsoft.com/office/word/2018/wordml/cex" xmlns:w16cid="http://schemas.microsoft.com/office/word/2016/wordml/cid" xmlns:w16="http://schemas.microsoft.com/office/word/2018/wordml" xmlns:w16sdtdh="http://schemas.microsoft.com/office/word/2020/wordml/sdtdatahash" xmlns:w16se="http://schemas.microsoft.com/office/word/2015/wordml/symex" xmlns:wpg="http://schemas.microsoft.com/office/word/2010/wordprocessingGroup" xmlns:wpi="http://schemas.microsoft.com/office/word/2010/wordprocessingInk" xmlns:wne="http://schemas.microsoft.com/office/word/2006/wordml" xmlns:wps="http://schemas.microsoft.com/office/word/2010/wordprocessingShape" mc:Ignorable="w14 w15 w16se w16cid w16 w16cex w16sdtdh wp14">
+<w:endnotes xmlns:wpc="http://schemas.microsoft.com/office/word/2010/wordprocessingCanvas" xmlns:cx="http://schemas.microsoft.com/office/drawing/2014/chartex" xmlns:cx1="http://schemas.microsoft.com/office/drawing/2015/9/8/chartex" xmlns:cx2="http://schemas.microsoft.com/office/drawing/2015/10/21/chartex" xmlns:cx3="http://schemas.microsoft.com/office/drawing/2016/5/9/chartex" xmlns:cx4="http://schemas.microsoft.com/office/drawing/2016/5/10/chartex" xmlns:cx5="http://schemas.microsoft.com/office/drawing/2016/5/11/chartex" xmlns:cx6="http://schemas.microsoft.com/office/drawing/2016/5/12/chartex" xmlns:cx7="http://schemas.microsoft.com/office/drawing/2016/5/13/chartex" xmlns:cx8="http://schemas.microsoft.com/office/drawing/2016/5/14/chartex" xmlns:mc="http://schemas.openxmlformats.org/markup-compatibility/2006" xmlns:aink="http://schemas.microsoft.com/office/drawing/2016/ink" xmlns:am3d="http://schemas.microsoft.com/office/drawing/2017/model3d" xmlns:o="urn:schemas-microsoft-com:office:office" xmlns:oel="http://schemas.microsoft.com/office/2019/extlst" xmlns:r="http://schemas.openxmlformats.org/officeDocument/2006/relationships" xmlns:m="http://schemas.openxmlformats.org/officeDocument/2006/math" xmlns:v="urn:schemas-microsoft-com:vml" xmlns:wp14="http://schemas.microsoft.com/office/word/2010/wordprocessingDrawing" xmlns:wp="http://schemas.openxmlformats.org/drawingml/2006/wordprocessingDrawing" xmlns:w10="urn:schemas-microsoft-com:office:word" xmlns:w="http://schemas.openxmlformats.org/wordprocessingml/2006/main" xmlns:w14="http://schemas.microsoft.com/office/word/2010/wordml" xmlns:w15="http://schemas.microsoft.com/office/word/2012/wordml" xmlns:w16cex="http://schemas.microsoft.com/office/word/2018/wordml/cex" xmlns:w16cid="http://schemas.microsoft.com/office/word/2016/wordml/cid" xmlns:w16="http://schemas.microsoft.com/office/word/2018/wordml" xmlns:w16du="http://schemas.microsoft.com/office/word/2023/wordml/word16du" xmlns:w16sdtdh="http://schemas.microsoft.com/office/word/2020/wordml/sdtdatahash" xmlns:w16sdtfl="http://schemas.microsoft.com/office/word/2024/wordml/sdtformatlock" xmlns:w16se="http://schemas.microsoft.com/office/word/2015/wordml/symex" xmlns:wpg="http://schemas.microsoft.com/office/word/2010/wordprocessingGroup" xmlns:wpi="http://schemas.microsoft.com/office/word/2010/wordprocessingInk" xmlns:wne="http://schemas.microsoft.com/office/word/2006/wordml" xmlns:wps="http://schemas.microsoft.com/office/word/2010/wordprocessingShape" mc:Ignorable="w14 w15 w16se w16cid w16 w16cex w16sdtdh w16sdtfl w16du wp14">
   <w:endnote w:type="separator" w:id="-1">
     <w:p>
       <w:r>
@@ -779,7 +423,7 @@
 </file>
 
 <file path=word/footnotes.xml><?xml version="1.0" encoding="utf-8"?>
-<w:footnotes xmlns:wpc="http://schemas.microsoft.com/office/word/2010/wordprocessingCanvas" xmlns:cx="http://schemas.microsoft.com/office/drawing/2014/chartex" xmlns:cx1="http://schemas.microsoft.com/office/drawing/2015/9/8/chartex" xmlns:cx2="http://schemas.microsoft.com/office/drawing/2015/10/21/chartex" xmlns:cx3="http://schemas.microsoft.com/office/drawing/2016/5/9/chartex" xmlns:cx4="http://schemas.microsoft.com/office/drawing/2016/5/10/chartex" xmlns:cx5="http://schemas.microsoft.com/office/drawing/2016/5/11/chartex" xmlns:cx6="http://schemas.microsoft.com/office/drawing/2016/5/12/chartex" xmlns:cx7="http://schemas.microsoft.com/office/drawing/2016/5/13/chartex" xmlns:cx8="http://schemas.microsoft.com/office/drawing/2016/5/14/chartex" xmlns:mc="http://schemas.openxmlformats.org/markup-compatibility/2006" xmlns:aink="http://schemas.microsoft.com/office/drawing/2016/ink" xmlns:am3d="http://schemas.microsoft.com/office/drawing/2017/model3d" xmlns:o="urn:schemas-microsoft-com:office:office" xmlns:r="http://schemas.openxmlformats.org/officeDocument/2006/relationships" xmlns:m="http://schemas.openxmlformats.org/officeDocument/2006/math" xmlns:v="urn:schemas-microsoft-com:vml" xmlns:wp14="http://schemas.microsoft.com/office/word/2010/wordprocessingDrawing" xmlns:wp="http://schemas.openxmlformats.org/drawingml/2006/wordprocessingDrawing" xmlns:w10="urn:schemas-microsoft-com:office:word" xmlns:w="http://schemas.openxmlformats.org/wordprocessingml/2006/main" xmlns:w14="http://schemas.microsoft.com/office/word/2010/wordml" xmlns:w15="http://schemas.microsoft.com/office/word/2012/wordml" xmlns:w16cex="http://schemas.microsoft.com/office/word/2018/wordml/cex" xmlns:w16cid="http://schemas.microsoft.com/office/word/2016/wordml/cid" xmlns:w16="http://schemas.microsoft.com/office/word/2018/wordml" xmlns:w16sdtdh="http://schemas.microsoft.com/office/word/2020/wordml/sdtdatahash" xmlns:w16se="http://schemas.microsoft.com/office/word/2015/wordml/symex" xmlns:wpg="http://schemas.microsoft.com/office/word/2010/wordprocessingGroup" xmlns:wpi="http://schemas.microsoft.com/office/word/2010/wordprocessingInk" xmlns:wne="http://schemas.microsoft.com/office/word/2006/wordml" xmlns:wps="http://schemas.microsoft.com/office/word/2010/wordprocessingShape" mc:Ignorable="w14 w15 w16se w16cid w16 w16cex w16sdtdh wp14">
+<w:footnotes xmlns:wpc="http://schemas.microsoft.com/office/word/2010/wordprocessingCanvas" xmlns:cx="http://schemas.microsoft.com/office/drawing/2014/chartex" xmlns:cx1="http://schemas.microsoft.com/office/drawing/2015/9/8/chartex" xmlns:cx2="http://schemas.microsoft.com/office/drawing/2015/10/21/chartex" xmlns:cx3="http://schemas.microsoft.com/office/drawing/2016/5/9/chartex" xmlns:cx4="http://schemas.microsoft.com/office/drawing/2016/5/10/chartex" xmlns:cx5="http://schemas.microsoft.com/office/drawing/2016/5/11/chartex" xmlns:cx6="http://schemas.microsoft.com/office/drawing/2016/5/12/chartex" xmlns:cx7="http://schemas.microsoft.com/office/drawing/2016/5/13/chartex" xmlns:cx8="http://schemas.microsoft.com/office/drawing/2016/5/14/chartex" xmlns:mc="http://schemas.openxmlformats.org/markup-compatibility/2006" xmlns:aink="http://schemas.microsoft.com/office/drawing/2016/ink" xmlns:am3d="http://schemas.microsoft.com/office/drawing/2017/model3d" xmlns:o="urn:schemas-microsoft-com:office:office" xmlns:oel="http://schemas.microsoft.com/office/2019/extlst" xmlns:r="http://schemas.openxmlformats.org/officeDocument/2006/relationships" xmlns:m="http://schemas.openxmlformats.org/officeDocument/2006/math" xmlns:v="urn:schemas-microsoft-com:vml" xmlns:wp14="http://schemas.microsoft.com/office/word/2010/wordprocessingDrawing" xmlns:wp="http://schemas.openxmlformats.org/drawingml/2006/wordprocessingDrawing" xmlns:w10="urn:schemas-microsoft-com:office:word" xmlns:w="http://schemas.openxmlformats.org/wordprocessingml/2006/main" xmlns:w14="http://schemas.microsoft.com/office/word/2010/wordml" xmlns:w15="http://schemas.microsoft.com/office/word/2012/wordml" xmlns:w16cex="http://schemas.microsoft.com/office/word/2018/wordml/cex" xmlns:w16cid="http://schemas.microsoft.com/office/word/2016/wordml/cid" xmlns:w16="http://schemas.microsoft.com/office/word/2018/wordml" xmlns:w16du="http://schemas.microsoft.com/office/word/2023/wordml/word16du" xmlns:w16sdtdh="http://schemas.microsoft.com/office/word/2020/wordml/sdtdatahash" xmlns:w16sdtfl="http://schemas.microsoft.com/office/word/2024/wordml/sdtformatlock" xmlns:w16se="http://schemas.microsoft.com/office/word/2015/wordml/symex" xmlns:wpg="http://schemas.microsoft.com/office/word/2010/wordprocessingGroup" xmlns:wpi="http://schemas.microsoft.com/office/word/2010/wordprocessingInk" xmlns:wne="http://schemas.microsoft.com/office/word/2006/wordml" xmlns:wps="http://schemas.microsoft.com/office/word/2010/wordprocessingShape" mc:Ignorable="w14 w15 w16se w16cid w16 w16cex w16sdtdh w16sdtfl w16du wp14">
   <w:footnote w:type="separator" w:id="-1">
     <w:p>
       <w:r>
@@ -798,7 +442,7 @@
 </file>
 
 <file path=word/header1.xml><?xml version="1.0" encoding="utf-8"?>
-<w:hdr xmlns:wpc="http://schemas.microsoft.com/office/word/2010/wordprocessingCanvas" xmlns:cx="http://schemas.microsoft.com/office/drawing/2014/chartex" xmlns:cx1="http://schemas.microsoft.com/office/drawing/2015/9/8/chartex" xmlns:cx2="http://schemas.microsoft.com/office/drawing/2015/10/21/chartex" xmlns:cx3="http://schemas.microsoft.com/office/drawing/2016/5/9/chartex" xmlns:cx4="http://schemas.microsoft.com/office/drawing/2016/5/10/chartex" xmlns:cx5="http://schemas.microsoft.com/office/drawing/2016/5/11/chartex" xmlns:cx6="http://schemas.microsoft.com/office/drawing/2016/5/12/chartex" xmlns:cx7="http://schemas.microsoft.com/office/drawing/2016/5/13/chartex" xmlns:cx8="http://schemas.microsoft.com/office/drawing/2016/5/14/chartex" xmlns:mc="http://schemas.openxmlformats.org/markup-compatibility/2006" xmlns:aink="http://schemas.microsoft.com/office/drawing/2016/ink" xmlns:am3d="http://schemas.microsoft.com/office/drawing/2017/model3d" xmlns:o="urn:schemas-microsoft-com:office:office" xmlns:r="http://schemas.openxmlformats.org/officeDocument/2006/relationships" xmlns:m="http://schemas.openxmlformats.org/officeDocument/2006/math" xmlns:v="urn:schemas-microsoft-com:vml" xmlns:wp14="http://schemas.microsoft.com/office/word/2010/wordprocessingDrawing" xmlns:wp="http://schemas.openxmlformats.org/drawingml/2006/wordprocessingDrawing" xmlns:w10="urn:schemas-microsoft-com:office:word" xmlns:w="http://schemas.openxmlformats.org/wordprocessingml/2006/main" xmlns:w14="http://schemas.microsoft.com/office/word/2010/wordml" xmlns:w15="http://schemas.microsoft.com/office/word/2012/wordml" xmlns:w16cex="http://schemas.microsoft.com/office/word/2018/wordml/cex" xmlns:w16cid="http://schemas.microsoft.com/office/word/2016/wordml/cid" xmlns:w16="http://schemas.microsoft.com/office/word/2018/wordml" xmlns:w16sdtdh="http://schemas.microsoft.com/office/word/2020/wordml/sdtdatahash" xmlns:w16se="http://schemas.microsoft.com/office/word/2015/wordml/symex" xmlns:wpg="http://schemas.microsoft.com/office/word/2010/wordprocessingGroup" xmlns:wpi="http://schemas.microsoft.com/office/word/2010/wordprocessingInk" xmlns:wne="http://schemas.microsoft.com/office/word/2006/wordml" xmlns:wps="http://schemas.microsoft.com/office/word/2010/wordprocessingShape" mc:Ignorable="w14 w15 w16se w16cid w16 w16cex w16sdtdh wp14">
+<w:hdr xmlns:wpc="http://schemas.microsoft.com/office/word/2010/wordprocessingCanvas" xmlns:cx="http://schemas.microsoft.com/office/drawing/2014/chartex" xmlns:cx1="http://schemas.microsoft.com/office/drawing/2015/9/8/chartex" xmlns:cx2="http://schemas.microsoft.com/office/drawing/2015/10/21/chartex" xmlns:cx3="http://schemas.microsoft.com/office/drawing/2016/5/9/chartex" xmlns:cx4="http://schemas.microsoft.com/office/drawing/2016/5/10/chartex" xmlns:cx5="http://schemas.microsoft.com/office/drawing/2016/5/11/chartex" xmlns:cx6="http://schemas.microsoft.com/office/drawing/2016/5/12/chartex" xmlns:cx7="http://schemas.microsoft.com/office/drawing/2016/5/13/chartex" xmlns:cx8="http://schemas.microsoft.com/office/drawing/2016/5/14/chartex" xmlns:mc="http://schemas.openxmlformats.org/markup-compatibility/2006" xmlns:aink="http://schemas.microsoft.com/office/drawing/2016/ink" xmlns:am3d="http://schemas.microsoft.com/office/drawing/2017/model3d" xmlns:o="urn:schemas-microsoft-com:office:office" xmlns:oel="http://schemas.microsoft.com/office/2019/extlst" xmlns:r="http://schemas.openxmlformats.org/officeDocument/2006/relationships" xmlns:m="http://schemas.openxmlformats.org/officeDocument/2006/math" xmlns:v="urn:schemas-microsoft-com:vml" xmlns:wp14="http://schemas.microsoft.com/office/word/2010/wordprocessingDrawing" xmlns:wp="http://schemas.openxmlformats.org/drawingml/2006/wordprocessingDrawing" xmlns:w10="urn:schemas-microsoft-com:office:word" xmlns:w="http://schemas.openxmlformats.org/wordprocessingml/2006/main" xmlns:w14="http://schemas.microsoft.com/office/word/2010/wordml" xmlns:w15="http://schemas.microsoft.com/office/word/2012/wordml" xmlns:w16cex="http://schemas.microsoft.com/office/word/2018/wordml/cex" xmlns:w16cid="http://schemas.microsoft.com/office/word/2016/wordml/cid" xmlns:w16="http://schemas.microsoft.com/office/word/2018/wordml" xmlns:w16du="http://schemas.microsoft.com/office/word/2023/wordml/word16du" xmlns:w16sdtdh="http://schemas.microsoft.com/office/word/2020/wordml/sdtdatahash" xmlns:w16sdtfl="http://schemas.microsoft.com/office/word/2024/wordml/sdtformatlock" xmlns:w16se="http://schemas.microsoft.com/office/word/2015/wordml/symex" xmlns:wpg="http://schemas.microsoft.com/office/word/2010/wordprocessingGroup" xmlns:wpi="http://schemas.microsoft.com/office/word/2010/wordprocessingInk" xmlns:wne="http://schemas.microsoft.com/office/word/2006/wordml" xmlns:wps="http://schemas.microsoft.com/office/word/2010/wordprocessingShape" mc:Ignorable="w14 w15 w16se w16cid w16 w16cex w16sdtdh w16sdtfl w16du wp14">
   <w:p>
     <w:pPr>
       <w:rPr>
@@ -809,7 +453,6 @@
     <w:r>
       <w:rPr>
         <w:rFonts w:ascii="Times New Roman" w:eastAsia="Times New Roman" w:hAnsi="Times New Roman" w:cs="Times New Roman"/>
-        <w:noProof/>
         <w:lang w:eastAsia="en-GB"/>
       </w:rPr>
       <w:drawing>
@@ -893,7 +536,6 @@
     <w:r>
       <w:rPr>
         <w:rFonts w:ascii="Times New Roman" w:eastAsia="Times New Roman" w:hAnsi="Times New Roman" w:cs="Times New Roman"/>
-        <w:noProof/>
         <w:lang w:eastAsia="en-GB"/>
       </w:rPr>
       <w:drawing>
@@ -1000,19 +642,19 @@
   </w:p>
   <w:p>
     <w:pPr>
-      <w:pStyle w:val="Header"/>
+      <w:pStyle w:val="Hlavika"/>
     </w:pPr>
   </w:p>
   <w:p>
     <w:pPr>
-      <w:pStyle w:val="Header"/>
+      <w:pStyle w:val="Hlavika"/>
     </w:pPr>
   </w:p>
 </w:hdr>
 </file>
 
 <file path=word/numbering.xml><?xml version="1.0" encoding="utf-8"?>
-<w:numbering xmlns:wpc="http://schemas.microsoft.com/office/word/2010/wordprocessingCanvas" xmlns:cx="http://schemas.microsoft.com/office/drawing/2014/chartex" xmlns:cx1="http://schemas.microsoft.com/office/drawing/2015/9/8/chartex" xmlns:cx2="http://schemas.microsoft.com/office/drawing/2015/10/21/chartex" xmlns:cx3="http://schemas.microsoft.com/office/drawing/2016/5/9/chartex" xmlns:cx4="http://schemas.microsoft.com/office/drawing/2016/5/10/chartex" xmlns:cx5="http://schemas.microsoft.com/office/drawing/2016/5/11/chartex" xmlns:cx6="http://schemas.microsoft.com/office/drawing/2016/5/12/chartex" xmlns:cx7="http://schemas.microsoft.com/office/drawing/2016/5/13/chartex" xmlns:cx8="http://schemas.microsoft.com/office/drawing/2016/5/14/chartex" xmlns:mc="http://schemas.openxmlformats.org/markup-compatibility/2006" xmlns:aink="http://schemas.microsoft.com/office/drawing/2016/ink" xmlns:am3d="http://schemas.microsoft.com/office/drawing/2017/model3d" xmlns:o="urn:schemas-microsoft-com:office:office" xmlns:r="http://schemas.openxmlformats.org/officeDocument/2006/relationships" xmlns:m="http://schemas.openxmlformats.org/officeDocument/2006/math" xmlns:v="urn:schemas-microsoft-com:vml" xmlns:wp14="http://schemas.microsoft.com/office/word/2010/wordprocessingDrawing" xmlns:wp="http://schemas.openxmlformats.org/drawingml/2006/wordprocessingDrawing" xmlns:w10="urn:schemas-microsoft-com:office:word" xmlns:w="http://schemas.openxmlformats.org/wordprocessingml/2006/main" xmlns:w14="http://schemas.microsoft.com/office/word/2010/wordml" xmlns:w15="http://schemas.microsoft.com/office/word/2012/wordml" xmlns:w16cex="http://schemas.microsoft.com/office/word/2018/wordml/cex" xmlns:w16cid="http://schemas.microsoft.com/office/word/2016/wordml/cid" xmlns:w16="http://schemas.microsoft.com/office/word/2018/wordml" xmlns:w16sdtdh="http://schemas.microsoft.com/office/word/2020/wordml/sdtdatahash" xmlns:w16se="http://schemas.microsoft.com/office/word/2015/wordml/symex" xmlns:wpg="http://schemas.microsoft.com/office/word/2010/wordprocessingGroup" xmlns:wpi="http://schemas.microsoft.com/office/word/2010/wordprocessingInk" xmlns:wne="http://schemas.microsoft.com/office/word/2006/wordml" xmlns:wps="http://schemas.microsoft.com/office/word/2010/wordprocessingShape" mc:Ignorable="w14 w15 w16se w16cid w16 w16cex w16sdtdh wp14">
+<w:numbering xmlns:wpc="http://schemas.microsoft.com/office/word/2010/wordprocessingCanvas" xmlns:cx="http://schemas.microsoft.com/office/drawing/2014/chartex" xmlns:cx1="http://schemas.microsoft.com/office/drawing/2015/9/8/chartex" xmlns:cx2="http://schemas.microsoft.com/office/drawing/2015/10/21/chartex" xmlns:cx3="http://schemas.microsoft.com/office/drawing/2016/5/9/chartex" xmlns:cx4="http://schemas.microsoft.com/office/drawing/2016/5/10/chartex" xmlns:cx5="http://schemas.microsoft.com/office/drawing/2016/5/11/chartex" xmlns:cx6="http://schemas.microsoft.com/office/drawing/2016/5/12/chartex" xmlns:cx7="http://schemas.microsoft.com/office/drawing/2016/5/13/chartex" xmlns:cx8="http://schemas.microsoft.com/office/drawing/2016/5/14/chartex" xmlns:mc="http://schemas.openxmlformats.org/markup-compatibility/2006" xmlns:aink="http://schemas.microsoft.com/office/drawing/2016/ink" xmlns:am3d="http://schemas.microsoft.com/office/drawing/2017/model3d" xmlns:o="urn:schemas-microsoft-com:office:office" xmlns:oel="http://schemas.microsoft.com/office/2019/extlst" xmlns:r="http://schemas.openxmlformats.org/officeDocument/2006/relationships" xmlns:m="http://schemas.openxmlformats.org/officeDocument/2006/math" xmlns:v="urn:schemas-microsoft-com:vml" xmlns:wp14="http://schemas.microsoft.com/office/word/2010/wordprocessingDrawing" xmlns:wp="http://schemas.openxmlformats.org/drawingml/2006/wordprocessingDrawing" xmlns:w10="urn:schemas-microsoft-com:office:word" xmlns:w="http://schemas.openxmlformats.org/wordprocessingml/2006/main" xmlns:w14="http://schemas.microsoft.com/office/word/2010/wordml" xmlns:w15="http://schemas.microsoft.com/office/word/2012/wordml" xmlns:w16cex="http://schemas.microsoft.com/office/word/2018/wordml/cex" xmlns:w16cid="http://schemas.microsoft.com/office/word/2016/wordml/cid" xmlns:w16="http://schemas.microsoft.com/office/word/2018/wordml" xmlns:w16du="http://schemas.microsoft.com/office/word/2023/wordml/word16du" xmlns:w16sdtdh="http://schemas.microsoft.com/office/word/2020/wordml/sdtdatahash" xmlns:w16sdtfl="http://schemas.microsoft.com/office/word/2024/wordml/sdtformatlock" xmlns:w16se="http://schemas.microsoft.com/office/word/2015/wordml/symex" xmlns:wpg="http://schemas.microsoft.com/office/word/2010/wordprocessingGroup" xmlns:wpi="http://schemas.microsoft.com/office/word/2010/wordprocessingInk" xmlns:wne="http://schemas.microsoft.com/office/word/2006/wordml" xmlns:wps="http://schemas.microsoft.com/office/word/2010/wordprocessingShape" mc:Ignorable="w14 w15 w16se w16cid w16 w16cex w16sdtdh w16sdtfl w16du wp14">
   <w:abstractNum w:abstractNumId="0" w15:restartNumberingAfterBreak="0">
     <w:nsid w:val="15C71CD8"/>
     <w:multiLevelType w:val="hybridMultilevel"/>
@@ -1438,30 +1080,30 @@
       </w:rPr>
     </w:lvl>
   </w:abstractNum>
-  <w:num w:numId="1">
+  <w:num w:numId="1" w16cid:durableId="1010452040">
     <w:abstractNumId w:val="2"/>
   </w:num>
-  <w:num w:numId="2">
+  <w:num w:numId="2" w16cid:durableId="2019765982">
     <w:abstractNumId w:val="0"/>
   </w:num>
-  <w:num w:numId="3">
+  <w:num w:numId="3" w16cid:durableId="684483706">
     <w:abstractNumId w:val="1"/>
   </w:num>
-  <w:num w:numId="4">
+  <w:num w:numId="4" w16cid:durableId="966274006">
     <w:abstractNumId w:val="3"/>
   </w:num>
 </w:numbering>
 </file>
 
 <file path=word/styles.xml><?xml version="1.0" encoding="utf-8"?>
-<w:styles xmlns:mc="http://schemas.openxmlformats.org/markup-compatibility/2006" xmlns:r="http://schemas.openxmlformats.org/officeDocument/2006/relationships" xmlns:w="http://schemas.openxmlformats.org/wordprocessingml/2006/main" xmlns:w14="http://schemas.microsoft.com/office/word/2010/wordml" xmlns:w15="http://schemas.microsoft.com/office/word/2012/wordml" xmlns:w16cex="http://schemas.microsoft.com/office/word/2018/wordml/cex" xmlns:w16cid="http://schemas.microsoft.com/office/word/2016/wordml/cid" xmlns:w16="http://schemas.microsoft.com/office/word/2018/wordml" xmlns:w16sdtdh="http://schemas.microsoft.com/office/word/2020/wordml/sdtdatahash" xmlns:w16se="http://schemas.microsoft.com/office/word/2015/wordml/symex" mc:Ignorable="w14 w15 w16se w16cid w16 w16cex w16sdtdh">
+<w:styles xmlns:mc="http://schemas.openxmlformats.org/markup-compatibility/2006" xmlns:r="http://schemas.openxmlformats.org/officeDocument/2006/relationships" xmlns:w="http://schemas.openxmlformats.org/wordprocessingml/2006/main" xmlns:w14="http://schemas.microsoft.com/office/word/2010/wordml" xmlns:w15="http://schemas.microsoft.com/office/word/2012/wordml" xmlns:w16cex="http://schemas.microsoft.com/office/word/2018/wordml/cex" xmlns:w16cid="http://schemas.microsoft.com/office/word/2016/wordml/cid" xmlns:w16="http://schemas.microsoft.com/office/word/2018/wordml" xmlns:w16du="http://schemas.microsoft.com/office/word/2023/wordml/word16du" xmlns:w16sdtdh="http://schemas.microsoft.com/office/word/2020/wordml/sdtdatahash" xmlns:w16sdtfl="http://schemas.microsoft.com/office/word/2024/wordml/sdtformatlock" xmlns:w16se="http://schemas.microsoft.com/office/word/2015/wordml/symex" mc:Ignorable="w14 w15 w16se w16cid w16 w16cex w16sdtdh w16sdtfl w16du">
   <w:docDefaults>
     <w:rPrDefault>
       <w:rPr>
         <w:rFonts w:asciiTheme="minorHAnsi" w:eastAsiaTheme="minorHAnsi" w:hAnsiTheme="minorHAnsi" w:cstheme="minorBidi"/>
         <w:sz w:val="24"/>
         <w:szCs w:val="24"/>
-        <w:lang w:val="en-CZ" w:eastAsia="en-US" w:bidi="ar-SA"/>
+        <w:lang w:eastAsia="en-US" w:bidi="ar-SA"/>
       </w:rPr>
     </w:rPrDefault>
     <w:pPrDefault/>
@@ -1844,16 +1486,19 @@
     <w:lsdException w:name="Unresolved Mention" w:semiHidden="1" w:unhideWhenUsed="1"/>
     <w:lsdException w:name="Smart Link" w:semiHidden="1" w:unhideWhenUsed="1"/>
   </w:latentStyles>
-  <w:style w:type="paragraph" w:default="1" w:styleId="Normal">
+  <w:style w:type="paragraph" w:default="1" w:styleId="Normlny">
     <w:name w:val="Normal"/>
     <w:qFormat/>
     <w:rsid w:val="006D764D"/>
+    <w:rPr>
+      <w:lang w:val="sk-SK"/>
+    </w:rPr>
   </w:style>
-  <w:style w:type="paragraph" w:styleId="Heading1">
+  <w:style w:type="paragraph" w:styleId="Nadpis1">
     <w:name w:val="heading 1"/>
-    <w:basedOn w:val="Normal"/>
-    <w:next w:val="Normal"/>
-    <w:link w:val="Heading1Char"/>
+    <w:basedOn w:val="Normlny"/>
+    <w:next w:val="Normlny"/>
+    <w:link w:val="Nadpis1Char"/>
     <w:uiPriority w:val="9"/>
     <w:qFormat/>
     <w:rsid w:val="004F5DF2"/>
@@ -1871,11 +1516,11 @@
       <w:szCs w:val="32"/>
     </w:rPr>
   </w:style>
-  <w:style w:type="paragraph" w:styleId="Heading2">
+  <w:style w:type="paragraph" w:styleId="Nadpis2">
     <w:name w:val="heading 2"/>
-    <w:basedOn w:val="Normal"/>
-    <w:next w:val="Normal"/>
-    <w:link w:val="Heading2Char"/>
+    <w:basedOn w:val="Normlny"/>
+    <w:next w:val="Normlny"/>
+    <w:link w:val="Nadpis2Char"/>
     <w:uiPriority w:val="9"/>
     <w:unhideWhenUsed/>
     <w:qFormat/>
@@ -1893,11 +1538,11 @@
       <w:szCs w:val="26"/>
     </w:rPr>
   </w:style>
-  <w:style w:type="paragraph" w:styleId="Heading3">
+  <w:style w:type="paragraph" w:styleId="Nadpis3">
     <w:name w:val="heading 3"/>
-    <w:basedOn w:val="Normal"/>
-    <w:next w:val="Normal"/>
-    <w:link w:val="Heading3Char"/>
+    <w:basedOn w:val="Normlny"/>
+    <w:next w:val="Normlny"/>
+    <w:link w:val="Nadpis3Char"/>
     <w:uiPriority w:val="9"/>
     <w:unhideWhenUsed/>
     <w:qFormat/>
@@ -1913,12 +1558,13 @@
       <w:color w:val="1F3763" w:themeColor="accent1" w:themeShade="7F"/>
     </w:rPr>
   </w:style>
-  <w:style w:type="character" w:default="1" w:styleId="DefaultParagraphFont">
+  <w:style w:type="character" w:default="1" w:styleId="Predvolenpsmoodseku">
     <w:name w:val="Default Paragraph Font"/>
     <w:uiPriority w:val="1"/>
+    <w:semiHidden/>
     <w:unhideWhenUsed/>
   </w:style>
-  <w:style w:type="table" w:default="1" w:styleId="TableNormal">
+  <w:style w:type="table" w:default="1" w:styleId="Normlnatabuka">
     <w:name w:val="Normal Table"/>
     <w:uiPriority w:val="99"/>
     <w:semiHidden/>
@@ -1933,15 +1579,15 @@
       </w:tblCellMar>
     </w:tblPr>
   </w:style>
-  <w:style w:type="numbering" w:default="1" w:styleId="NoList">
+  <w:style w:type="numbering" w:default="1" w:styleId="Bezzoznamu">
     <w:name w:val="No List"/>
     <w:uiPriority w:val="99"/>
     <w:semiHidden/>
     <w:unhideWhenUsed/>
   </w:style>
-  <w:style w:type="paragraph" w:styleId="NormalWeb">
+  <w:style w:type="paragraph" w:styleId="Normlnywebov">
     <w:name w:val="Normal (Web)"/>
-    <w:basedOn w:val="Normal"/>
+    <w:basedOn w:val="Normlny"/>
     <w:uiPriority w:val="99"/>
     <w:semiHidden/>
     <w:unhideWhenUsed/>
@@ -1954,10 +1600,10 @@
       <w:lang w:eastAsia="en-GB"/>
     </w:rPr>
   </w:style>
-  <w:style w:type="paragraph" w:styleId="Header">
+  <w:style w:type="paragraph" w:styleId="Hlavika">
     <w:name w:val="header"/>
-    <w:basedOn w:val="Normal"/>
-    <w:link w:val="HeaderChar"/>
+    <w:basedOn w:val="Normlny"/>
+    <w:link w:val="HlavikaChar"/>
     <w:uiPriority w:val="99"/>
     <w:unhideWhenUsed/>
     <w:rsid w:val="00D8461A"/>
@@ -1968,17 +1614,17 @@
       </w:tabs>
     </w:pPr>
   </w:style>
-  <w:style w:type="character" w:customStyle="1" w:styleId="HeaderChar">
-    <w:name w:val="Header Char"/>
-    <w:basedOn w:val="DefaultParagraphFont"/>
-    <w:link w:val="Header"/>
+  <w:style w:type="character" w:customStyle="1" w:styleId="HlavikaChar">
+    <w:name w:val="Hlavička Char"/>
+    <w:basedOn w:val="Predvolenpsmoodseku"/>
+    <w:link w:val="Hlavika"/>
     <w:uiPriority w:val="99"/>
     <w:rsid w:val="00D8461A"/>
   </w:style>
-  <w:style w:type="paragraph" w:styleId="Footer">
+  <w:style w:type="paragraph" w:styleId="Pta">
     <w:name w:val="footer"/>
-    <w:basedOn w:val="Normal"/>
-    <w:link w:val="FooterChar"/>
+    <w:basedOn w:val="Normlny"/>
+    <w:link w:val="PtaChar"/>
     <w:uiPriority w:val="99"/>
     <w:unhideWhenUsed/>
     <w:rsid w:val="00D8461A"/>
@@ -1989,17 +1635,17 @@
       </w:tabs>
     </w:pPr>
   </w:style>
-  <w:style w:type="character" w:customStyle="1" w:styleId="FooterChar">
-    <w:name w:val="Footer Char"/>
-    <w:basedOn w:val="DefaultParagraphFont"/>
-    <w:link w:val="Footer"/>
+  <w:style w:type="character" w:customStyle="1" w:styleId="PtaChar">
+    <w:name w:val="Päta Char"/>
+    <w:basedOn w:val="Predvolenpsmoodseku"/>
+    <w:link w:val="Pta"/>
     <w:uiPriority w:val="99"/>
     <w:rsid w:val="00D8461A"/>
   </w:style>
-  <w:style w:type="character" w:customStyle="1" w:styleId="Heading1Char">
-    <w:name w:val="Heading 1 Char"/>
-    <w:basedOn w:val="DefaultParagraphFont"/>
-    <w:link w:val="Heading1"/>
+  <w:style w:type="character" w:customStyle="1" w:styleId="Nadpis1Char">
+    <w:name w:val="Nadpis 1 Char"/>
+    <w:basedOn w:val="Predvolenpsmoodseku"/>
+    <w:link w:val="Nadpis1"/>
     <w:uiPriority w:val="9"/>
     <w:rsid w:val="004F5DF2"/>
     <w:rPr>
@@ -2009,10 +1655,10 @@
       <w:szCs w:val="32"/>
     </w:rPr>
   </w:style>
-  <w:style w:type="character" w:customStyle="1" w:styleId="Heading2Char">
-    <w:name w:val="Heading 2 Char"/>
-    <w:basedOn w:val="DefaultParagraphFont"/>
-    <w:link w:val="Heading2"/>
+  <w:style w:type="character" w:customStyle="1" w:styleId="Nadpis2Char">
+    <w:name w:val="Nadpis 2 Char"/>
+    <w:basedOn w:val="Predvolenpsmoodseku"/>
+    <w:link w:val="Nadpis2"/>
     <w:uiPriority w:val="9"/>
     <w:rsid w:val="009811A0"/>
     <w:rPr>
@@ -2022,10 +1668,10 @@
       <w:szCs w:val="26"/>
     </w:rPr>
   </w:style>
-  <w:style w:type="character" w:customStyle="1" w:styleId="Heading3Char">
-    <w:name w:val="Heading 3 Char"/>
-    <w:basedOn w:val="DefaultParagraphFont"/>
-    <w:link w:val="Heading3"/>
+  <w:style w:type="character" w:customStyle="1" w:styleId="Nadpis3Char">
+    <w:name w:val="Nadpis 3 Char"/>
+    <w:basedOn w:val="Predvolenpsmoodseku"/>
+    <w:link w:val="Nadpis3"/>
     <w:uiPriority w:val="9"/>
     <w:rsid w:val="00844068"/>
     <w:rPr>
@@ -2033,9 +1679,9 @@
       <w:color w:val="1F3763" w:themeColor="accent1" w:themeShade="7F"/>
     </w:rPr>
   </w:style>
-  <w:style w:type="paragraph" w:styleId="ListParagraph">
+  <w:style w:type="paragraph" w:styleId="Odsekzoznamu">
     <w:name w:val="List Paragraph"/>
-    <w:basedOn w:val="Normal"/>
+    <w:basedOn w:val="Normlny"/>
     <w:uiPriority w:val="34"/>
     <w:qFormat/>
     <w:rsid w:val="009811A0"/>
@@ -2044,10 +1690,10 @@
       <w:contextualSpacing/>
     </w:pPr>
   </w:style>
-  <w:style w:type="paragraph" w:styleId="Caption">
+  <w:style w:type="paragraph" w:styleId="Popis">
     <w:name w:val="caption"/>
-    <w:basedOn w:val="Normal"/>
-    <w:next w:val="Normal"/>
+    <w:basedOn w:val="Normlny"/>
+    <w:next w:val="Normlny"/>
     <w:uiPriority w:val="35"/>
     <w:unhideWhenUsed/>
     <w:qFormat/>
@@ -2063,9 +1709,9 @@
       <w:szCs w:val="18"/>
     </w:rPr>
   </w:style>
-  <w:style w:type="character" w:styleId="Hyperlink">
+  <w:style w:type="character" w:styleId="Hypertextovprepojenie">
     <w:name w:val="Hyperlink"/>
-    <w:basedOn w:val="DefaultParagraphFont"/>
+    <w:basedOn w:val="Predvolenpsmoodseku"/>
     <w:uiPriority w:val="99"/>
     <w:unhideWhenUsed/>
     <w:rsid w:val="003F5F03"/>
@@ -2074,9 +1720,9 @@
       <w:u w:val="single"/>
     </w:rPr>
   </w:style>
-  <w:style w:type="character" w:styleId="UnresolvedMention">
+  <w:style w:type="character" w:styleId="Nevyrieenzmienka">
     <w:name w:val="Unresolved Mention"/>
-    <w:basedOn w:val="DefaultParagraphFont"/>
+    <w:basedOn w:val="Predvolenpsmoodseku"/>
     <w:uiPriority w:val="99"/>
     <w:semiHidden/>
     <w:unhideWhenUsed/>
@@ -2086,9 +1732,9 @@
       <w:shd w:val="clear" w:color="auto" w:fill="E1DFDD"/>
     </w:rPr>
   </w:style>
-  <w:style w:type="character" w:styleId="FollowedHyperlink">
+  <w:style w:type="character" w:styleId="PouitHypertextovPrepojenie">
     <w:name w:val="FollowedHyperlink"/>
-    <w:basedOn w:val="DefaultParagraphFont"/>
+    <w:basedOn w:val="Predvolenpsmoodseku"/>
     <w:uiPriority w:val="99"/>
     <w:semiHidden/>
     <w:unhideWhenUsed/>

</xml_diff>